<commit_message>
docs: add GSA expert opinion package
</commit_message>
<xml_diff>
--- a/docs/business/kernscale/gsa/output/Kernscale-GSA-Projektidee-Arbeitsfassung.docx
+++ b/docs/business/kernscale/gsa/output/Kernscale-GSA-Projektidee-Arbeitsfassung.docx
@@ -34,7 +34,7 @@
           <w:color w:val="1F2328"/>
           <w:sz w:val="50"/>
         </w:rPr>
-        <w:t>Kernscale Media Intelligence Loop</w:t>
+        <w:t>Levial by Kernscale</w:t>
       </w:r>
     </w:p>
     <w:p>
@@ -562,6 +562,7 @@
     </w:p>
     <w:p>
       <w:pPr>
+        <w:keepLines/>
         <w:spacing w:before="80" w:after="160" w:line="240" w:lineRule="auto"/>
         <w:ind w:left="259" w:right="259"/>
         <w:jc w:val="left"/>
@@ -770,6 +771,7 @@
     </w:p>
     <w:p>
       <w:pPr>
+        <w:keepLines/>
         <w:spacing w:before="80" w:after="160" w:line="240" w:lineRule="auto"/>
         <w:ind w:left="259" w:right="259"/>
         <w:jc w:val="left"/>
@@ -1155,6 +1157,7 @@
     </w:p>
     <w:p>
       <w:pPr>
+        <w:keepLines/>
         <w:spacing w:before="80" w:after="160" w:line="240" w:lineRule="auto"/>
         <w:ind w:left="259" w:right="259"/>
         <w:jc w:val="left"/>
@@ -2928,9 +2931,9 @@
       <w:suff w:val="tab"/>
       <w:pPr>
         <w:tabs>
-          <w:tab w:val="num" w:pos="540"/>
+          <w:tab w:val="num" w:pos="720"/>
         </w:tabs>
-        <w:ind w:left="540" w:hanging="280"/>
+        <w:ind w:left="720" w:hanging="360"/>
         <w:spacing w:after="80" w:line="290" w:lineRule="auto"/>
       </w:pPr>
     </w:lvl>

</xml_diff>